<commit_message>
docs(biblioteca): 8 manuales Word de la Biblioteca actualizados a la ultima version de sus generadores (Admin, Canales, Cobranza v2.0, Conta, RRHH, Motores, Seguridad, Te Presentamos)
Co-Authored-By: Claude Fable 5 <noreply@anthropic.com>
</commit_message>
<xml_diff>
--- a/api-gateway/public/mantenedores/documentacion/descargas/Seguridad-Contingencia-Business-Suite.docx
+++ b/api-gateway/public/mantenedores/documentacion/descargas/Seguridad-Contingencia-Business-Suite.docx
@@ -1130,7 +1130,7 @@
               <w:rPr>
                 <w:sz w:val="19"/>
               </w:rPr>
-              <w:t>Respaldo automático del proveedor + volcado nocturno propio (02:17) a artefacto privado</w:t>
+              <w:t>Respaldo automático del proveedor + volcado nocturno propio (02:17) a GitHub + tercera copia nocturna en Google (regla de las tres copias)</w:t>
             </w:r>
           </w:p>
         </w:tc>
@@ -1143,7 +1143,7 @@
               <w:rPr>
                 <w:sz w:val="19"/>
               </w:rPr>
-              <w:t>1 día + 30 días</w:t>
+              <w:t>1 día + 30 días + 90 días</w:t>
             </w:r>
           </w:p>
         </w:tc>
@@ -1171,7 +1171,7 @@
               <w:rPr>
                 <w:sz w:val="19"/>
               </w:rPr>
-              <w:t>Bucket de Google Cloud, fuera de la base</w:t>
+              <w:t>Bucket de Google Cloud (versionado) + bucket espejo en otra región + paquete semanal a GitHub</w:t>
             </w:r>
           </w:p>
         </w:tc>

</xml_diff>